<commit_message>
Update Simula readiness and sync spec artifacts
</commit_message>
<xml_diff>
--- a/docs/docx/specs/clinerules-agents-spec-apple.docx
+++ b/docs/docx/specs/clinerules-agents-spec-apple.docx
@@ -26,6 +26,32 @@
         <w:t xml:space="preserve">April 2026 (Revised)</w:t>
       </w:r>
     </w:p>
+    <w:sdt>
+      <w:sdtPr>
+        <w:docPartObj>
+          <w:docPartGallery w:val="Table of Contents"/>
+          <w:docPartUnique/>
+        </w:docPartObj>
+      </w:sdtPr>
+      <w:sdtContent>
+        <w:p>
+          <w:pPr>
+            <w:pStyle w:val="TOCHeading"/>
+          </w:pPr>
+          <w:r>
+            <w:t xml:space="preserve">Table of Contents</w:t>
+          </w:r>
+        </w:p>
+        <w:p>
+          <w:r>
+            <w:fldChar w:fldCharType="begin" w:dirty="true"/>
+            <w:instrText xml:space="preserve">TOC \o "1-3" \h \z \u</w:instrText>
+            <w:fldChar w:fldCharType="separate"/>
+            <w:fldChar w:fldCharType="end"/>
+          </w:r>
+        </w:p>
+      </w:sdtContent>
+    </w:sdt>
     <w:bookmarkStart w:id="15" w:name="ch:frontmatter"/>
     <w:p>
       <w:pPr>
@@ -7788,7 +7814,7 @@
     </w:p>
     <w:bookmarkEnd w:id="79"/>
     <w:bookmarkEnd w:id="80"/>
-    <w:bookmarkStart w:id="95" w:name="ch:swarm"/>
+    <w:bookmarkStart w:id="99" w:name="ch:swarm"/>
     <w:p>
       <w:pPr>
         <w:pStyle w:val="Heading1"/>
@@ -7944,7 +7970,7 @@
       </w:r>
     </w:p>
     <w:bookmarkEnd w:id="82"/>
-    <w:bookmarkStart w:id="83" w:name="interaction-model"/>
+    <w:bookmarkStart w:id="87" w:name="interaction-model"/>
     <w:p>
       <w:pPr>
         <w:pStyle w:val="Heading2"/>
@@ -7953,35 +7979,78 @@
         <w:t xml:space="preserve">Interaction model</w:t>
       </w:r>
     </w:p>
+    <w:bookmarkStart w:id="86" w:name="fig:swarm"/>
+    <w:p>
+      <w:pPr>
+        <w:pStyle w:val="CaptionedFigure"/>
+      </w:pPr>
+      <w:r>
+        <w:drawing>
+          <wp:inline>
+            <wp:extent cx="3733800" cy="3447064"/>
+            <wp:effectExtent b="0" l="0" r="0" t="0"/>
+            <wp:docPr descr="" title="" id="84" name="Picture"/>
+            <a:graphic>
+              <a:graphicData uri="http://schemas.openxmlformats.org/drawingml/2006/picture">
+                <pic:pic>
+                  <pic:nvPicPr>
+                    <pic:cNvPr descr="diagrams/swarm.png" id="85" name="Picture"/>
+                    <pic:cNvPicPr>
+                      <a:picLocks noChangeArrowheads="1" noChangeAspect="1"/>
+                    </pic:cNvPicPr>
+                  </pic:nvPicPr>
+                  <pic:blipFill>
+                    <a:blip r:embed="rId83"/>
+                    <a:stretch>
+                      <a:fillRect/>
+                    </a:stretch>
+                  </pic:blipFill>
+                  <pic:spPr bwMode="auto">
+                    <a:xfrm>
+                      <a:off x="0" y="0"/>
+                      <a:ext cx="3733800" cy="3447064"/>
+                    </a:xfrm>
+                    <a:prstGeom prst="rect">
+                      <a:avLst/>
+                    </a:prstGeom>
+                    <a:noFill/>
+                    <a:ln w="9525">
+                      <a:noFill/>
+                      <a:headEnd/>
+                      <a:tailEnd/>
+                    </a:ln>
+                  </pic:spPr>
+                </pic:pic>
+              </a:graphicData>
+            </a:graphic>
+          </wp:inline>
+        </w:drawing>
+      </w:r>
+    </w:p>
+    <w:p>
+      <w:pPr>
+        <w:pStyle w:val="ImageCaption"/>
+      </w:pPr>
+      <w:r>
+        <w:t xml:space="preserve">Minimum swarm for governed spec delivery.</w:t>
+      </w:r>
+    </w:p>
+    <w:bookmarkEnd w:id="86"/>
+    <w:bookmarkEnd w:id="87"/>
+    <w:bookmarkStart w:id="96" w:name="sec:inter-agent-signaling"/>
+    <w:p>
+      <w:pPr>
+        <w:pStyle w:val="Heading2"/>
+      </w:pPr>
+      <w:r>
+        <w:t xml:space="preserve">Inter-agent signaling</w:t>
+      </w:r>
+    </w:p>
     <w:p>
       <w:pPr>
         <w:pStyle w:val="FirstParagraph"/>
       </w:pPr>
       <w:r>
-        <w:t xml:space="preserve">Minimum swarm for governed spec delivery.</w:t>
-      </w:r>
-      <w:r>
-        <w:t xml:space="preserve"> </w:t>
-      </w:r>
-      <w:r>
-        <w:t xml:space="preserve">fig:swarm</w:t>
-      </w:r>
-    </w:p>
-    <w:bookmarkEnd w:id="83"/>
-    <w:bookmarkStart w:id="92" w:name="sec:inter-agent-signaling"/>
-    <w:p>
-      <w:pPr>
-        <w:pStyle w:val="Heading2"/>
-      </w:pPr>
-      <w:r>
-        <w:t xml:space="preserve">Inter-agent signaling</w:t>
-      </w:r>
-    </w:p>
-    <w:p>
-      <w:pPr>
-        <w:pStyle w:val="FirstParagraph"/>
-      </w:pPr>
-      <w:r>
         <w:t xml:space="preserve">Agents within the swarm MUST NOT rely on direct network calls to each</w:t>
       </w:r>
       <w:r>
@@ -8003,7 +8072,7 @@
         <w:t xml:space="preserve">and prevents tight coupling between agent implementations.</w:t>
       </w:r>
     </w:p>
-    <w:bookmarkStart w:id="85" w:name="signal-types"/>
+    <w:bookmarkStart w:id="89" w:name="signal-types"/>
     <w:p>
       <w:pPr>
         <w:pStyle w:val="Heading3"/>
@@ -8012,7 +8081,7 @@
         <w:t xml:space="preserve">Signal types</w:t>
       </w:r>
     </w:p>
-    <w:bookmarkStart w:id="84" w:name="tab:signal-types"/>
+    <w:bookmarkStart w:id="88" w:name="tab:signal-types"/>
     <w:p>
       <w:pPr>
         <w:pStyle w:val="TableCaption"/>
@@ -8239,9 +8308,9 @@
         </w:tc>
       </w:tr>
     </w:tbl>
-    <w:bookmarkEnd w:id="84"/>
-    <w:bookmarkEnd w:id="85"/>
-    <w:bookmarkStart w:id="87" w:name="blocking-signals"/>
+    <w:bookmarkEnd w:id="88"/>
+    <w:bookmarkEnd w:id="89"/>
+    <w:bookmarkStart w:id="91" w:name="blocking-signals"/>
     <w:p>
       <w:pPr>
         <w:pStyle w:val="Heading3"/>
@@ -8264,7 +8333,7 @@
         <w:t xml:space="preserve">or deployment should be halted:</w:t>
       </w:r>
     </w:p>
-    <w:bookmarkStart w:id="86" w:name="tab:blocking-signals"/>
+    <w:bookmarkStart w:id="90" w:name="tab:blocking-signals"/>
     <w:p>
       <w:pPr>
         <w:pStyle w:val="TableCaption"/>
@@ -8388,7 +8457,7 @@
         </w:tc>
       </w:tr>
     </w:tbl>
-    <w:bookmarkEnd w:id="86"/>
+    <w:bookmarkEnd w:id="90"/>
     <w:p>
       <w:pPr>
         <w:pStyle w:val="BodyText"/>
@@ -8462,8 +8531,8 @@
         <w:t xml:space="preserve">}</w:t>
       </w:r>
     </w:p>
-    <w:bookmarkEnd w:id="87"/>
-    <w:bookmarkStart w:id="88" w:name="state-validation-signals"/>
+    <w:bookmarkEnd w:id="91"/>
+    <w:bookmarkStart w:id="92" w:name="state-validation-signals"/>
     <w:p>
       <w:pPr>
         <w:pStyle w:val="Heading3"/>
@@ -8606,8 +8675,8 @@
         <w:t xml:space="preserve">.</w:t>
       </w:r>
     </w:p>
-    <w:bookmarkEnd w:id="88"/>
-    <w:bookmarkStart w:id="90" w:name="completion-signals"/>
+    <w:bookmarkEnd w:id="92"/>
+    <w:bookmarkStart w:id="94" w:name="completion-signals"/>
     <w:p>
       <w:pPr>
         <w:pStyle w:val="Heading3"/>
@@ -8630,7 +8699,7 @@
         <w:t xml:space="preserve">messages:</w:t>
       </w:r>
     </w:p>
-    <w:bookmarkStart w:id="89" w:name="tab:completion-signals"/>
+    <w:bookmarkStart w:id="93" w:name="tab:completion-signals"/>
     <w:p>
       <w:pPr>
         <w:pStyle w:val="TableCaption"/>
@@ -8754,9 +8823,9 @@
         </w:tc>
       </w:tr>
     </w:tbl>
-    <w:bookmarkEnd w:id="89"/>
-    <w:bookmarkEnd w:id="90"/>
-    <w:bookmarkStart w:id="91" w:name="signal-consumption-rules"/>
+    <w:bookmarkEnd w:id="93"/>
+    <w:bookmarkEnd w:id="94"/>
+    <w:bookmarkStart w:id="95" w:name="signal-consumption-rules"/>
     <w:p>
       <w:pPr>
         <w:pStyle w:val="Heading3"/>
@@ -8842,9 +8911,9 @@
         <w:t xml:space="preserve">trail.</w:t>
       </w:r>
     </w:p>
-    <w:bookmarkEnd w:id="91"/>
-    <w:bookmarkEnd w:id="92"/>
-    <w:bookmarkStart w:id="93" w:name="swarm-sequencing"/>
+    <w:bookmarkEnd w:id="95"/>
+    <w:bookmarkEnd w:id="96"/>
+    <w:bookmarkStart w:id="97" w:name="swarm-sequencing"/>
     <w:p>
       <w:pPr>
         <w:pStyle w:val="Heading2"/>
@@ -8909,8 +8978,8 @@
         <w:t xml:space="preserve">Only then assemble and publish the PDF specifications.</w:t>
       </w:r>
     </w:p>
-    <w:bookmarkEnd w:id="93"/>
-    <w:bookmarkStart w:id="94" w:name="non-negotiable-swarm-rules"/>
+    <w:bookmarkEnd w:id="97"/>
+    <w:bookmarkStart w:id="98" w:name="non-negotiable-swarm-rules"/>
     <w:p>
       <w:pPr>
         <w:pStyle w:val="Heading2"/>
@@ -8964,9 +9033,9 @@
         <w:t xml:space="preserve">build if the live system still violates the regulations contract.</w:t>
       </w:r>
     </w:p>
-    <w:bookmarkEnd w:id="94"/>
-    <w:bookmarkEnd w:id="95"/>
-    <w:bookmarkStart w:id="108" w:name="ch:validation"/>
+    <w:bookmarkEnd w:id="98"/>
+    <w:bookmarkEnd w:id="99"/>
+    <w:bookmarkStart w:id="112" w:name="ch:validation"/>
     <w:p>
       <w:pPr>
         <w:pStyle w:val="Heading1"/>
@@ -8975,7 +9044,7 @@
         <w:t xml:space="preserve">Validation and Acceptance</w:t>
       </w:r>
     </w:p>
-    <w:bookmarkStart w:id="96" w:name="rule-pack-validation"/>
+    <w:bookmarkStart w:id="100" w:name="rule-pack-validation"/>
     <w:p>
       <w:pPr>
         <w:pStyle w:val="Heading2"/>
@@ -9059,8 +9128,8 @@
         <w:t xml:space="preserve">operational baseline.</w:t>
       </w:r>
     </w:p>
-    <w:bookmarkEnd w:id="96"/>
-    <w:bookmarkStart w:id="97" w:name="recommended-benchmark-baseline"/>
+    <w:bookmarkEnd w:id="100"/>
+    <w:bookmarkStart w:id="101" w:name="recommended-benchmark-baseline"/>
     <w:p>
       <w:pPr>
         <w:pStyle w:val="Heading2"/>
@@ -9150,8 +9219,8 @@
         <w:t xml:space="preserve">operational specificity.</w:t>
       </w:r>
     </w:p>
-    <w:bookmarkEnd w:id="97"/>
-    <w:bookmarkStart w:id="100" w:name="sec:benchmark-scorecard"/>
+    <w:bookmarkEnd w:id="101"/>
+    <w:bookmarkStart w:id="104" w:name="sec:benchmark-scorecard"/>
     <w:p>
       <w:pPr>
         <w:pStyle w:val="Heading2"/>
@@ -9198,7 +9267,7 @@
         <w:t xml:space="preserve">requirement.</w:t>
       </w:r>
     </w:p>
-    <w:bookmarkStart w:id="98" w:name="scorecard-metrics"/>
+    <w:bookmarkStart w:id="102" w:name="scorecard-metrics"/>
     <w:p>
       <w:pPr>
         <w:pStyle w:val="Heading3"/>
@@ -9393,8 +9462,8 @@
         <w:br/>
       </w:r>
     </w:p>
-    <w:bookmarkEnd w:id="98"/>
-    <w:bookmarkStart w:id="99" w:name="scoring-algorithm"/>
+    <w:bookmarkEnd w:id="102"/>
+    <w:bookmarkStart w:id="103" w:name="scoring-algorithm"/>
     <w:p>
       <w:pPr>
         <w:pStyle w:val="Heading3"/>
@@ -9705,9 +9774,9 @@
         <w:t xml:space="preserve">worse than the baseline values.</w:t>
       </w:r>
     </w:p>
-    <w:bookmarkEnd w:id="99"/>
-    <w:bookmarkEnd w:id="100"/>
-    <w:bookmarkStart w:id="103" w:name="the-.baseline-clinerules-pointer"/>
+    <w:bookmarkEnd w:id="103"/>
+    <w:bookmarkEnd w:id="104"/>
+    <w:bookmarkStart w:id="107" w:name="the-.baseline-clinerules-pointer"/>
     <w:p>
       <w:pPr>
         <w:pStyle w:val="Heading2"/>
@@ -9742,7 +9811,7 @@
         <w:t xml:space="preserve">requiring a specification update or code change to the harness.</w:t>
       </w:r>
     </w:p>
-    <w:bookmarkStart w:id="101" w:name="scorecard-output-format"/>
+    <w:bookmarkStart w:id="105" w:name="scorecard-output-format"/>
     <w:p>
       <w:pPr>
         <w:pStyle w:val="Heading3"/>
@@ -9896,8 +9965,8 @@
         <w:t xml:space="preserve">}</w:t>
       </w:r>
     </w:p>
-    <w:bookmarkEnd w:id="101"/>
-    <w:bookmarkStart w:id="102" w:name="scorecard-integration"/>
+    <w:bookmarkEnd w:id="105"/>
+    <w:bookmarkStart w:id="106" w:name="scorecard-integration"/>
     <w:p>
       <w:pPr>
         <w:pStyle w:val="Heading3"/>
@@ -9971,9 +10040,9 @@
         <w:t xml:space="preserve">).</w:t>
       </w:r>
     </w:p>
-    <w:bookmarkEnd w:id="102"/>
-    <w:bookmarkEnd w:id="103"/>
-    <w:bookmarkStart w:id="105" w:name="acceptance-commands"/>
+    <w:bookmarkEnd w:id="106"/>
+    <w:bookmarkEnd w:id="107"/>
+    <w:bookmarkStart w:id="109" w:name="acceptance-commands"/>
     <w:p>
       <w:pPr>
         <w:pStyle w:val="Heading2"/>
@@ -9982,7 +10051,7 @@
         <w:t xml:space="preserve">Acceptance commands</w:t>
       </w:r>
     </w:p>
-    <w:bookmarkStart w:id="104" w:name="tab:acceptance"/>
+    <w:bookmarkStart w:id="108" w:name="tab:acceptance"/>
     <w:p>
       <w:pPr>
         <w:pStyle w:val="TableCaption"/>
@@ -10191,9 +10260,9 @@
         </w:tc>
       </w:tr>
     </w:tbl>
-    <w:bookmarkEnd w:id="104"/>
-    <w:bookmarkEnd w:id="105"/>
-    <w:bookmarkStart w:id="106" w:name="publication-criteria"/>
+    <w:bookmarkEnd w:id="108"/>
+    <w:bookmarkEnd w:id="109"/>
+    <w:bookmarkStart w:id="110" w:name="publication-criteria"/>
     <w:p>
       <w:pPr>
         <w:pStyle w:val="Heading2"/>
@@ -10271,8 +10340,8 @@
         <w:t xml:space="preserve">expected to run live.</w:t>
       </w:r>
     </w:p>
-    <w:bookmarkEnd w:id="106"/>
-    <w:bookmarkStart w:id="107" w:name="failure-conditions"/>
+    <w:bookmarkEnd w:id="110"/>
+    <w:bookmarkStart w:id="111" w:name="failure-conditions"/>
     <w:p>
       <w:pPr>
         <w:pStyle w:val="Heading2"/>
@@ -10331,9 +10400,9 @@
         <w:t xml:space="preserve">PDF build succeeds but the supporting rule-pack harness fails.</w:t>
       </w:r>
     </w:p>
-    <w:bookmarkEnd w:id="107"/>
-    <w:bookmarkEnd w:id="108"/>
-    <w:bookmarkStart w:id="115" w:name="ch:references"/>
+    <w:bookmarkEnd w:id="111"/>
+    <w:bookmarkEnd w:id="112"/>
+    <w:bookmarkStart w:id="119" w:name="ch:references"/>
     <w:p>
       <w:pPr>
         <w:pStyle w:val="Heading1"/>
@@ -10342,7 +10411,7 @@
         <w:t xml:space="preserve">References</w:t>
       </w:r>
     </w:p>
-    <w:bookmarkStart w:id="109" w:name="normative-references"/>
+    <w:bookmarkStart w:id="113" w:name="normative-references"/>
     <w:p>
       <w:pPr>
         <w:pStyle w:val="Heading2"/>
@@ -10351,8 +10420,8 @@
         <w:t xml:space="preserve">Normative references</w:t>
       </w:r>
     </w:p>
-    <w:bookmarkEnd w:id="109"/>
-    <w:bookmarkStart w:id="110" w:name="schema-references"/>
+    <w:bookmarkEnd w:id="113"/>
+    <w:bookmarkStart w:id="114" w:name="schema-references"/>
     <w:p>
       <w:pPr>
         <w:pStyle w:val="Heading2"/>
@@ -10361,8 +10430,8 @@
         <w:t xml:space="preserve">Schema references</w:t>
       </w:r>
     </w:p>
-    <w:bookmarkEnd w:id="110"/>
-    <w:bookmarkStart w:id="111" w:name="repository-rule-pack-references"/>
+    <w:bookmarkEnd w:id="114"/>
+    <w:bookmarkStart w:id="115" w:name="repository-rule-pack-references"/>
     <w:p>
       <w:pPr>
         <w:pStyle w:val="Heading2"/>
@@ -10371,8 +10440,8 @@
         <w:t xml:space="preserve">Repository rule-pack references</w:t>
       </w:r>
     </w:p>
-    <w:bookmarkEnd w:id="111"/>
-    <w:bookmarkStart w:id="113" w:name="sec:version-history"/>
+    <w:bookmarkEnd w:id="115"/>
+    <w:bookmarkStart w:id="117" w:name="sec:version-history"/>
     <w:p>
       <w:pPr>
         <w:pStyle w:val="Heading2"/>
@@ -10381,7 +10450,7 @@
         <w:t xml:space="preserve">Version history</w:t>
       </w:r>
     </w:p>
-    <w:bookmarkStart w:id="112" w:name="tab:version-history"/>
+    <w:bookmarkStart w:id="116" w:name="tab:version-history"/>
     <w:p>
       <w:pPr>
         <w:pStyle w:val="TableCaption"/>
@@ -10639,9 +10708,9 @@
         </w:tc>
       </w:tr>
     </w:tbl>
-    <w:bookmarkEnd w:id="112"/>
-    <w:bookmarkEnd w:id="113"/>
-    <w:bookmarkStart w:id="114" w:name="cross-references-to-other-specifications"/>
+    <w:bookmarkEnd w:id="116"/>
+    <w:bookmarkEnd w:id="117"/>
+    <w:bookmarkStart w:id="118" w:name="cross-references-to-other-specifications"/>
     <w:p>
       <w:pPr>
         <w:pStyle w:val="Heading2"/>
@@ -10742,8 +10811,8 @@
         <w:t xml:space="preserve">(): May adopt the swarm delivery model for its governance needs.</w:t>
       </w:r>
     </w:p>
-    <w:bookmarkEnd w:id="114"/>
-    <w:bookmarkEnd w:id="115"/>
+    <w:bookmarkEnd w:id="118"/>
+    <w:bookmarkEnd w:id="119"/>
     <w:sectPr>
       <w:footnotePr>
         <w:numRestart w:val="eachSect"/>

</xml_diff>